<commit_message>
Busca nome e cargo de quem assina na aba Membros CADA
O rodapé do edital não usa mais "IARA LOPES DA SILVA" / "Coordenadora"
fixos. O script lê a aba "Membros CADA" (colunas NOME, CARGO, STATUS),
exige exatamente um membro com STATUS "Ativo" e usa nome/cargo dele
no template (placeholders {{ nome_membro }} / {{ cargo_membro }}).
Se houver zero ou mais de um membro ativo, o script para com erro
em vez de gerar um edital com assinatura incorreta.

Testado com membro ativo (nome e cargo corretos no docx gerado) e
sem membro ativo (erro claro antes de gerar qualquer documento).

Co-Authored-By: Claude Sonnet 5 <noreply@anthropic.com>
Claude-Session: https://claude.ai/code/session_014bdXuuNNiSb6ZTfo5bsJWD
</commit_message>
<xml_diff>
--- a/Modelos/modelo_edital.docx
+++ b/Modelos/modelo_edital.docx
@@ -131,7 +131,7 @@
         <w:jc w:val="both"/>
       </w:pPr>
       <w:r>
-        <w:t>IARA LOPES DA SILVA</w:t>
+        <w:t>{{ nome_membro }}</w:t>
       </w:r>
     </w:p>
     <w:p>
@@ -139,7 +139,7 @@
         <w:jc w:val="both"/>
       </w:pPr>
       <w:r>
-        <w:t>Coordenadora</w:t>
+        <w:t>{{ cargo_membro }}</w:t>
       </w:r>
     </w:p>
     <w:sectPr>

</xml_diff>